<commit_message>
Casa nova: o Adsum passa a morar em adsum.cin.ufpe.br
`CASA = CIN` e o repositório em `adsumhq/adsum`, em `endereco.ts`. O guia
e o manual saem de novo com o endereço oficial, e o README, o CLAUDE.md e
os documentos vivos apontam para ele. O endereço antigo vira a ponte.

Co-Authored-By: Claude Opus 5.5 <noreply@anthropic.com>
</commit_message>
<xml_diff>
--- a/docs/Adsum-manual-e-LGPD.docx
+++ b/docs/Adsum-manual-e-LGPD.docx
@@ -902,7 +902,7 @@
                 <w:sz w:val="20"/>
                 <w:szCs w:val="20"/>
               </w:rPr>
-              <w:t xml:space="preserve">willianrupert.github.io/adsum/#/vitrine</w:t>
+              <w:t xml:space="preserve">adsum.cin.ufpe.br/#/vitrine</w:t>
             </w:r>
             <w:r>
               <w:rPr>
@@ -6069,7 +6069,7 @@
           <w:sz w:val="20"/>
           <w:szCs w:val="20"/>
         </w:rPr>
-        <w:t xml:space="preserve">github.com/willianrupert/adsum</w:t>
+        <w:t xml:space="preserve">github.com/adsumhq/adsum</w:t>
       </w:r>
     </w:p>
     <w:sectPr>

</xml_diff>